<commit_message>
Hoàn thiện kế hoạch Bài 4 cho một thành viên
</commit_message>
<xml_diff>
--- a/BaoCaoKyNangSo.docx
+++ b/BaoCaoKyNangSo.docx
@@ -2024,7 +2024,7 @@
         <w:rPr>
           <w:rFonts w:ascii="Arial" w:hAnsi="Arial" w:eastAsia="Arial"/>
         </w:rPr>
-        <w:t>Kế hoạch dự án nhóm</w:t>
+        <w:t>Kế hoạch Dự án 4</w:t>
       </w:r>
     </w:p>
     <w:p>
@@ -2036,7 +2036,7 @@
         <w:rPr>
           <w:rFonts w:ascii="Arial" w:hAnsi="Arial" w:eastAsia="Arial"/>
         </w:rPr>
-        <w:t>Nhóm chọn Dự án 4 trong danh sách mẫu và lập kế hoạch phát triển website quản lý chi tiêu cá nhân theo nhiều vòng lặp.</w:t>
+        <w:t>Dự án phát triển và giới thiệu ứng dụng quản lý chi tiêu cá nhân được lập kế hoạch trong 3 tuần, gồm 4 tính năng và 3 vòng phát triển. Thành viên duy nhất là Trần Ngọc Mơ.</w:t>
       </w:r>
     </w:p>
     <w:p>
@@ -2090,7 +2090,7 @@
           <w:color w:val="5D6B78"/>
           <w:sz w:val="17"/>
         </w:rPr>
-        <w:t>Hình 4  Bảng Kanban kế hoạch và phân công dự án</w:t>
+        <w:t>Hình 4  Bảng Kanban kế hoạch thực hiện và phân công nhiệm vụ</w:t>
       </w:r>
     </w:p>
     <w:tbl>
@@ -2116,7 +2116,7 @@
       <w:tr>
         <w:tc>
           <w:tcPr>
-            <w:tcW w:type="dxa" w:w="1871"/>
+            <w:tcW w:type="dxa" w:w="1701"/>
             <w:shd w:fill="0B1F33"/>
             <w:vAlign w:val="center"/>
             <w:tcMar>
@@ -2137,13 +2137,13 @@
                 <w:color w:val="FFFFFF"/>
                 <w:sz w:val="18"/>
               </w:rPr>
-              <w:t>Thành viên</w:t>
+              <w:t>Giai đoạn</w:t>
             </w:r>
           </w:p>
         </w:tc>
         <w:tc>
           <w:tcPr>
-            <w:tcW w:type="dxa" w:w="3515"/>
+            <w:tcW w:type="dxa" w:w="5726"/>
             <w:shd w:fill="0B1F33"/>
             <w:vAlign w:val="center"/>
             <w:tcMar>
@@ -2164,13 +2164,13 @@
                 <w:color w:val="FFFFFF"/>
                 <w:sz w:val="18"/>
               </w:rPr>
-              <w:t>Trách nhiệm chính</w:t>
+              <w:t>Nhiệm vụ và sản phẩm dự kiến</w:t>
             </w:r>
           </w:p>
         </w:tc>
         <w:tc>
           <w:tcPr>
-            <w:tcW w:type="dxa" w:w="4139"/>
+            <w:tcW w:type="dxa" w:w="2098"/>
             <w:shd w:fill="0B1F33"/>
             <w:vAlign w:val="center"/>
             <w:tcMar>
@@ -2191,7 +2191,7 @@
                 <w:color w:val="FFFFFF"/>
                 <w:sz w:val="18"/>
               </w:rPr>
-              <w:t>Sản phẩm phụ trách</w:t>
+              <w:t>Người phụ trách</w:t>
             </w:r>
           </w:p>
         </w:tc>
@@ -2199,7 +2199,55 @@
       <w:tr>
         <w:tc>
           <w:tcPr>
-            <w:tcW w:type="dxa" w:w="1871"/>
+            <w:tcW w:type="dxa" w:w="1701"/>
+            <w:vAlign w:val="center"/>
+            <w:tcMar>
+              <w:top w:w="90" w:type="dxa"/>
+              <w:start w:w="120" w:type="dxa"/>
+              <w:bottom w:w="90" w:type="dxa"/>
+              <w:end w:w="120" w:type="dxa"/>
+            </w:tcMar>
+          </w:tcPr>
+          <w:p>
+            <w:pPr>
+              <w:spacing w:after="0"/>
+            </w:pPr>
+            <w:r>
+              <w:rPr>
+                <w:rFonts w:ascii="Arial" w:hAnsi="Arial" w:eastAsia="Arial"/>
+                <w:sz w:val="17"/>
+              </w:rPr>
+              <w:t>Tuần 1</w:t>
+            </w:r>
+          </w:p>
+        </w:tc>
+        <w:tc>
+          <w:tcPr>
+            <w:tcW w:type="dxa" w:w="5726"/>
+            <w:vAlign w:val="center"/>
+            <w:tcMar>
+              <w:top w:w="90" w:type="dxa"/>
+              <w:start w:w="120" w:type="dxa"/>
+              <w:bottom w:w="90" w:type="dxa"/>
+              <w:end w:w="120" w:type="dxa"/>
+            </w:tcMar>
+          </w:tcPr>
+          <w:p>
+            <w:pPr>
+              <w:spacing w:after="0"/>
+            </w:pPr>
+            <w:r>
+              <w:rPr>
+                <w:rFonts w:ascii="Arial" w:hAnsi="Arial" w:eastAsia="Arial"/>
+                <w:sz w:val="17"/>
+              </w:rPr>
+              <w:t>Dùng AI động não, lập dàn ý 4 tính năng, 3 vòng phát triển, mã ban đầu, GitHub và tài liệu kế hoạch</w:t>
+            </w:r>
+          </w:p>
+        </w:tc>
+        <w:tc>
+          <w:tcPr>
+            <w:tcW w:type="dxa" w:w="2098"/>
             <w:vAlign w:val="center"/>
             <w:tcMar>
               <w:top w:w="90" w:type="dxa"/>
@@ -2221,59 +2269,11 @@
             </w:r>
           </w:p>
         </w:tc>
-        <w:tc>
-          <w:tcPr>
-            <w:tcW w:type="dxa" w:w="3515"/>
-            <w:vAlign w:val="center"/>
-            <w:tcMar>
-              <w:top w:w="90" w:type="dxa"/>
-              <w:start w:w="120" w:type="dxa"/>
-              <w:bottom w:w="90" w:type="dxa"/>
-              <w:end w:w="120" w:type="dxa"/>
-            </w:tcMar>
-          </w:tcPr>
-          <w:p>
-            <w:pPr>
-              <w:spacing w:after="0"/>
-            </w:pPr>
-            <w:r>
-              <w:rPr>
-                <w:rFonts w:ascii="Arial" w:hAnsi="Arial" w:eastAsia="Arial"/>
-                <w:sz w:val="17"/>
-              </w:rPr>
-              <w:t>Điều phối, giao diện và tài liệu</w:t>
-            </w:r>
-          </w:p>
-        </w:tc>
-        <w:tc>
-          <w:tcPr>
-            <w:tcW w:type="dxa" w:w="4139"/>
-            <w:vAlign w:val="center"/>
-            <w:tcMar>
-              <w:top w:w="90" w:type="dxa"/>
-              <w:start w:w="120" w:type="dxa"/>
-              <w:bottom w:w="90" w:type="dxa"/>
-              <w:end w:w="120" w:type="dxa"/>
-            </w:tcMar>
-          </w:tcPr>
-          <w:p>
-            <w:pPr>
-              <w:spacing w:after="0"/>
-            </w:pPr>
-            <w:r>
-              <w:rPr>
-                <w:rFonts w:ascii="Arial" w:hAnsi="Arial" w:eastAsia="Arial"/>
-                <w:sz w:val="17"/>
-              </w:rPr>
-              <w:t>Phạm vi, giao diện chính, biểu đồ và hướng dẫn</w:t>
-            </w:r>
-          </w:p>
-        </w:tc>
       </w:tr>
       <w:tr>
         <w:tc>
           <w:tcPr>
-            <w:tcW w:type="dxa" w:w="1871"/>
+            <w:tcW w:type="dxa" w:w="1701"/>
             <w:vAlign w:val="center"/>
             <w:tcMar>
               <w:top w:w="90" w:type="dxa"/>
@@ -2292,13 +2292,13 @@
                 <w:rFonts w:ascii="Arial" w:hAnsi="Arial" w:eastAsia="Arial"/>
                 <w:sz w:val="17"/>
               </w:rPr>
-              <w:t>Thành viên 2</w:t>
+              <w:t>Tuần 2</w:t>
             </w:r>
           </w:p>
         </w:tc>
         <w:tc>
           <w:tcPr>
-            <w:tcW w:type="dxa" w:w="3515"/>
+            <w:tcW w:type="dxa" w:w="5726"/>
             <w:vAlign w:val="center"/>
             <w:tcMar>
               <w:top w:w="90" w:type="dxa"/>
@@ -2317,13 +2317,13 @@
                 <w:rFonts w:ascii="Arial" w:hAnsi="Arial" w:eastAsia="Arial"/>
                 <w:sz w:val="17"/>
               </w:rPr>
-              <w:t>Dữ liệu và xử lý nghiệp vụ</w:t>
+              <w:t>Phát triển nhiều phiên bản, báo cáo nháp 5–10 trang và video demo 4–10 phút</w:t>
             </w:r>
           </w:p>
         </w:tc>
         <w:tc>
           <w:tcPr>
-            <w:tcW w:type="dxa" w:w="4139"/>
+            <w:tcW w:type="dxa" w:w="2098"/>
             <w:vAlign w:val="center"/>
             <w:tcMar>
               <w:top w:w="90" w:type="dxa"/>
@@ -2342,7 +2342,7 @@
                 <w:rFonts w:ascii="Arial" w:hAnsi="Arial" w:eastAsia="Arial"/>
                 <w:sz w:val="17"/>
               </w:rPr>
-              <w:t>Cấu trúc dữ liệu, giao dịch và bộ lọc</w:t>
+              <w:t>Trần Ngọc Mơ</w:t>
             </w:r>
           </w:p>
         </w:tc>
@@ -2350,7 +2350,7 @@
       <w:tr>
         <w:tc>
           <w:tcPr>
-            <w:tcW w:type="dxa" w:w="1871"/>
+            <w:tcW w:type="dxa" w:w="1701"/>
             <w:vAlign w:val="center"/>
             <w:tcMar>
               <w:top w:w="90" w:type="dxa"/>
@@ -2368,13 +2368,13 @@
                 <w:rFonts w:ascii="Arial" w:hAnsi="Arial" w:eastAsia="Arial"/>
                 <w:sz w:val="17"/>
               </w:rPr>
-              <w:t>Cả nhóm</w:t>
+              <w:t>Tuần 3</w:t>
             </w:r>
           </w:p>
         </w:tc>
         <w:tc>
           <w:tcPr>
-            <w:tcW w:type="dxa" w:w="3515"/>
+            <w:tcW w:type="dxa" w:w="5726"/>
             <w:vAlign w:val="center"/>
             <w:tcMar>
               <w:top w:w="90" w:type="dxa"/>
@@ -2392,13 +2392,13 @@
                 <w:rFonts w:ascii="Arial" w:hAnsi="Arial" w:eastAsia="Arial"/>
                 <w:sz w:val="17"/>
               </w:rPr>
-              <w:t>Kiểm thử và rà soát</w:t>
+              <w:t>Tạo 5–10 slide, báo cáo PDF/DOCX, trang phản ánh về công cụ AI, trình bày và trả lời câu hỏi</w:t>
             </w:r>
           </w:p>
         </w:tc>
         <w:tc>
           <w:tcPr>
-            <w:tcW w:type="dxa" w:w="4139"/>
+            <w:tcW w:type="dxa" w:w="2098"/>
             <w:vAlign w:val="center"/>
             <w:tcMar>
               <w:top w:w="90" w:type="dxa"/>
@@ -2416,7 +2416,7 @@
                 <w:rFonts w:ascii="Arial" w:hAnsi="Arial" w:eastAsia="Arial"/>
                 <w:sz w:val="17"/>
               </w:rPr>
-              <w:t>Tiêu chí kiểm thử, tích hợp và demo</w:t>
+              <w:t>Trần Ngọc Mơ</w:t>
             </w:r>
           </w:p>
         </w:tc>
@@ -2426,6 +2426,14 @@
       <w:pPr>
         <w:spacing w:after="40"/>
       </w:pPr>
+    </w:p>
+    <w:p>
+      <w:r>
+        <w:rPr>
+          <w:rFonts w:ascii="Arial" w:hAnsi="Arial" w:eastAsia="Arial"/>
+        </w:rPr>
+        <w:t>Bài 4 chỉ dừng ở bước lập kế hoạch và phân công; chưa yêu cầu hoàn thành dự án.</w:t>
+      </w:r>
     </w:p>
     <w:sectPr>
       <w:footerReference w:type="default" r:id="rId9"/>

</xml_diff>